<commit_message>
Fix answers for Q1 (D→C) and Q3 (D→A) + update rationale
- Q1: 正解改為 C(Amazon SageMaker Clarify 做公平性/偏差評估，發布 fairness metrics 到 CloudWatch 設警示，最少自訂開發)
- Q3: 正解改為 A(AWS Amplify AI Kit 在既有 Amplify/AppSync 架構上原生支援串流，保留 Knowledge Bases，改動最小)
- 依官方文件改寫兩題考點背法
- 同步重建 AWS_GenAI_Quiz.html 與修正版 docx；JSON/網頁/docx 三方一致

Co-Authored-By: Claude Opus 4.8 <noreply@anthropic.com>
</commit_message>
<xml_diff>
--- a/AWS_GenAI_Q1-Q97_題目格式_修正版.docx
+++ b/AWS_GenAI_Q1-Q97_題目格式_修正版.docx
@@ -43,7 +43,7 @@
           <w:b/>
           <w:color w:val="C00000"/>
         </w:rPr>
-        <w:t>answer: D</w:t>
+        <w:t>answer: C</w:t>
       </w:r>
     </w:p>
     <w:p>
@@ -56,7 +56,7 @@
     </w:p>
     <w:p>
       <w:r>
-        <w:t>「比較兩 prompt 公平性/偏差 + 最少自訂開發」→ Bedrock model evaluation job(內建評估)+ 依 demographic group 維度設 CloudWatch alarm。SageMaker Clarify(C)是 SageMaker ML 模型工具且需較多整合;自建 Lambda 後處理(A)開發量大。</w:t>
+        <w:t>「比較兩 prompt 的公平性/偏差 + 即時監控 + 最少自訂開發」→ Amazon SageMaker Clarify。Clarify 是 AWS 內建的負責任 AI(Responsible AI)工具，專門計算跨 demographic group 的 bias/fairness metrics(內建多種偏差指標)，可把 fairness metrics 發布到 CloudWatch 並設 alarm，群組間差異超過門檻(&gt;15%)即自動告警 — 不必自建後處理邏輯，開發量最少。D(Bedrock model evaluation job)偏一次性批次評估、非持續即時監控，且 InvocationsIntervened 是 Guardrails 的攔截計數指標、本身沒有 per-demographic-group 的公平性維度，機制對不上。A 需自建 Lambda 後處理，開發量最大；B 用 Guardrails 內容過濾衡量公平性也不對題。</w:t>
       </w:r>
     </w:p>
     <w:p>
@@ -167,7 +167,7 @@
           <w:b/>
           <w:color w:val="C00000"/>
         </w:rPr>
-        <w:t>answer: D</w:t>
+        <w:t>answer: A</w:t>
       </w:r>
     </w:p>
     <w:p>
@@ -180,7 +180,7 @@
     </w:p>
     <w:p>
       <w:r>
-        <w:t>複雜問題逾時/慢→改串流:InvokeModelWithResponseStream + WebSocket API,降低感知延遲。加大逾時/重試(B)不解決根本;SQS 輪詢(C)非即時串流。</w:t>
+        <w:t>既有架構已是 AWS Amplify + AppSync GraphQL，複雜問題逾時/慢 → 用「串流」降低感知延遲、且改動最小 → AWS Amplify AI Kit。AI Kit 在現有 Amplify/AppSync 堆疊上原生支援串流回應:Lambda 接收 Bedrock 串流 chunk → 推送到 AppSync → 前端用 subscription 即時逐字接收，並能優化 client-side 渲染，保留原本的 Knowledge Bases(RetrieveAndGenerate)檢索能力。D 把 RetrieveAndGenerate 換成 InvokeModelWithResponseStream 會失去 knowledge base 檢索，且改用 API Gateway WebSocket 等於重建整個架構，過度改動。加大逾時/重試(B)不解決根本延遲;改走 SQS 佇列輪詢(C)是非同步批次、非即時串流，使用者體驗更差。</w:t>
       </w:r>
     </w:p>
     <w:p>

</xml_diff>